<commit_message>
Add user registration and booking functionality with database setup
</commit_message>
<xml_diff>
--- a/documentation/test log.docx
+++ b/documentation/test log.docx
@@ -10,13 +10,13 @@
         <w:tblLook w:val="04A0" w:firstRow="1" w:lastRow="0" w:firstColumn="1" w:lastColumn="0" w:noHBand="0" w:noVBand="1"/>
       </w:tblPr>
       <w:tblGrid>
+        <w:gridCol w:w="1412"/>
+        <w:gridCol w:w="1131"/>
+        <w:gridCol w:w="990"/>
+        <w:gridCol w:w="1987"/>
         <w:gridCol w:w="1417"/>
-        <w:gridCol w:w="992"/>
-        <w:gridCol w:w="990"/>
-        <w:gridCol w:w="996"/>
-        <w:gridCol w:w="1559"/>
-        <w:gridCol w:w="3351"/>
-        <w:gridCol w:w="2319"/>
+        <w:gridCol w:w="2636"/>
+        <w:gridCol w:w="2051"/>
       </w:tblGrid>
       <w:tr>
         <w:tc>
@@ -296,16 +296,13 @@
           </w:tcPr>
           <w:p>
             <w:r>
-              <w:t xml:space="preserve">No </w:t>
-            </w:r>
-            <w:r>
-              <w:t xml:space="preserve">centring issues </w:t>
-            </w:r>
-            <w:r>
-              <w:t xml:space="preserve"> with </w:t>
-            </w:r>
-            <w:r>
-              <w:t>content</w:t>
+              <w:t xml:space="preserve">No centring </w:t>
+            </w:r>
+            <w:r>
+              <w:t>issues with</w:t>
+            </w:r>
+            <w:r>
+              <w:t xml:space="preserve"> content</w:t>
             </w:r>
           </w:p>
         </w:tc>
@@ -339,7 +336,10 @@
           </w:tcPr>
           <w:p>
             <w:r>
-              <w:t>26/03/2025</w:t>
+              <w:t>27</w:t>
+            </w:r>
+            <w:r>
+              <w:t>/03/2025</w:t>
             </w:r>
           </w:p>
         </w:tc>
@@ -354,7 +354,13 @@
           </w:p>
           <w:p>
             <w:r>
-              <w:t>(home)</w:t>
+              <w:t>(</w:t>
+            </w:r>
+            <w:r>
+              <w:t>register</w:t>
+            </w:r>
+            <w:r>
+              <w:t>)</w:t>
             </w:r>
           </w:p>
         </w:tc>
@@ -372,25 +378,77 @@
           <w:tcPr>
             <w:tcW w:w="996" w:type="dxa"/>
           </w:tcPr>
+          <w:p>
+            <w:r>
+              <w:t>Input testing,</w:t>
+            </w:r>
+          </w:p>
+          <w:p>
+            <w:hyperlink r:id="rId5" w:history="1">
+              <w:r>
+                <w:rPr>
+                  <w:rStyle w:val="Hyperlink"/>
+                </w:rPr>
+                <w:t>test@gmail.com</w:t>
+              </w:r>
+            </w:hyperlink>
+            <w:r>
+              <w:t>,</w:t>
+            </w:r>
+          </w:p>
+          <w:p>
+            <w:r>
+              <w:t>Hello123@,</w:t>
+            </w:r>
+          </w:p>
+          <w:p>
+            <w:r>
+              <w:t>Hello123@ into the registration page</w:t>
+            </w:r>
+          </w:p>
           <w:p/>
         </w:tc>
         <w:tc>
           <w:tcPr>
             <w:tcW w:w="1559" w:type="dxa"/>
           </w:tcPr>
-          <w:p/>
+          <w:p>
+            <w:r>
+              <w:t>Able to register a account</w:t>
+            </w:r>
+            <w:r>
+              <w:t xml:space="preserve"> without issue </w:t>
+            </w:r>
+          </w:p>
         </w:tc>
         <w:tc>
           <w:tcPr>
             <w:tcW w:w="3351" w:type="dxa"/>
           </w:tcPr>
-          <w:p/>
+          <w:p>
+            <w:r>
+              <w:t>There was a issue with registration, even when putting in appropriate inputs “</w:t>
+            </w:r>
+            <w:r>
+              <w:t>Username and password must be at least 4 characters</w:t>
+            </w:r>
+            <w:r>
+              <w:t>”</w:t>
+            </w:r>
+          </w:p>
         </w:tc>
         <w:tc>
           <w:tcPr>
             <w:tcW w:w="2319" w:type="dxa"/>
           </w:tcPr>
-          <w:p/>
+          <w:p>
+            <w:r>
+              <w:t>Edit html parameters to add requirements before submitio</w:t>
+            </w:r>
+            <w:r>
+              <w:t>n</w:t>
+            </w:r>
+          </w:p>
         </w:tc>
       </w:tr>
       <w:tr>
@@ -1099,7 +1157,6 @@
   <w:style w:type="character" w:default="1" w:styleId="DefaultParagraphFont">
     <w:name w:val="Default Paragraph Font"/>
     <w:uiPriority w:val="1"/>
-    <w:semiHidden/>
     <w:unhideWhenUsed/>
   </w:style>
   <w:style w:type="table" w:default="1" w:styleId="TableNormal">
@@ -1443,6 +1500,29 @@
         <w:insideV w:val="single" w:sz="4" w:space="0" w:color="auto"/>
       </w:tblBorders>
     </w:tblPr>
+  </w:style>
+  <w:style w:type="character" w:styleId="Hyperlink">
+    <w:name w:val="Hyperlink"/>
+    <w:basedOn w:val="DefaultParagraphFont"/>
+    <w:uiPriority w:val="99"/>
+    <w:unhideWhenUsed/>
+    <w:rsid w:val="0092792D"/>
+    <w:rPr>
+      <w:color w:val="467886" w:themeColor="hyperlink"/>
+      <w:u w:val="single"/>
+    </w:rPr>
+  </w:style>
+  <w:style w:type="character" w:styleId="UnresolvedMention">
+    <w:name w:val="Unresolved Mention"/>
+    <w:basedOn w:val="DefaultParagraphFont"/>
+    <w:uiPriority w:val="99"/>
+    <w:semiHidden/>
+    <w:unhideWhenUsed/>
+    <w:rsid w:val="0092792D"/>
+    <w:rPr>
+      <w:color w:val="605E5C"/>
+      <w:shd w:val="clear" w:color="auto" w:fill="E1DFDD"/>
+    </w:rPr>
   </w:style>
 </w:styles>
 </file>

</xml_diff>